<commit_message>
Re-review: evidence-quoted verdicts; fixed false positives (ultrasound, DiffTF++, subtitle collisions); recovered missed direct developments (TCT+, TCATrack, multimodal TCTrack)
</commit_message>
<xml_diff>
--- a/true_development_citations.docx
+++ b/true_development_citations.docx
@@ -7,7 +7,7 @@
         <w:pStyle w:val="Title"/>
       </w:pPr>
       <w:r>
-        <w:t>True Developments of TCTrack (Verified Paper-by-Paper)</w:t>
+        <w:t>True Developments of TCTrack (Re-Reviewed, Evidence-Quoted)</w:t>
       </w:r>
     </w:p>
     <w:p>
@@ -16,12 +16,12 @@
           <w:i/>
           <w:sz w:val="18"/>
         </w:rPr>
-        <w:t>Reference baseline: TCTrack: Temporal Contexts for Aerial Tracking (Cao et al., CVPR 2022, arXiv:2203.01885). Compiled 2026-10-11. Method: each of the 269 citing works was classified individually - TRUE_DEVELOPMENT only when the paper's own method builds on / extends / replaces a TCTrack component (TAdaCNN, adaptive temporal transformer, online temporal memory, or the framework as explicit base). Papers merely citing TCTrack as baseline/related work are excluded. Borderline cases are marked.</w:t>
+        <w:t>Reference baseline: TCTrack: Temporal Contexts for Aerial Tracking (Cao et al., CVPR 2022, arXiv:2203.01885). Compiled 2026-10-11. Method: all 269 citing works re-classified paper-by-paper with substring-exact title matching and abstract evidence quotes. DIRECT = abstract explicitly states build-on/baseline/framework derivation of TCTrack. SYSTEM_INTEGRATION = uses TCTrack as a pipeline component without developing it. ADJACENT = same temporal-context aerial-tracking line, discusses TCTrack's design, no demonstrable build-on. MENTION = citation/comparison only. This version corrects an earlier pass that had phrase-collision false positives and exact-title-match misses.</w:t>
       </w:r>
     </w:p>
     <w:p>
       <w:r>
-        <w:t>Classified: 269 | true/adjacent developments: 6 | mentions excluded: 256 | unverifiable without full text: 7.</w:t>
+        <w:t>DIRECT: 4 | SYSTEM_INTEGRATION: 1 | ADJACENT: 3 | MENTION: 254 | UNVERIFIABLE (no abstract): 7</w:t>
       </w:r>
     </w:p>
     <w:p>
@@ -29,7 +29,7 @@
         <w:pStyle w:val="Heading1"/>
       </w:pPr>
       <w:r>
-        <w:t>Adjacent developments (extend the TCTrack temporal-context line) (6)</w:t>
+        <w:t>Tier 1 - Direct developments of TCTrack (4)</w:t>
       </w:r>
     </w:p>
     <w:p>
@@ -62,7 +62,7 @@
           <w:i/>
           <w:sz w:val="18"/>
         </w:rPr>
-        <w:t>Why a development: modifies TCTrack's AT-Transformer component (matched: 'adaptive temporal transformer')</w:t>
+        <w:t>Verdict evidence: TCTrack++ (same authors). Evidence: "we propose a two-level framework (TCTrack)... Based on it, we propose a stronger version for real-world visual tracking, i.e., TCTrack++". Adds online background-exclusion modeling, TAdaCNNv2, refined AT-Transformer.</w:t>
       </w:r>
     </w:p>
     <w:p>
@@ -75,7 +75,175 @@
         <w:pStyle w:val="Heading2"/>
       </w:pPr>
       <w:r>
-        <w:t>2. Multi-Step Temporal Modeling for UAV Tracking (2024)</w:t>
+        <w:t>2. Sparse Transformer Refinement Similarity Map for Aerial Tracking (2024)</w:t>
+      </w:r>
+    </w:p>
+    <w:p>
+      <w:r>
+        <w:rPr>
+          <w:i/>
+          <w:sz w:val="18"/>
+        </w:rPr>
+        <w:t>Xi Tao, Ke Qi, Peijia Chen, Wenhao Xu, Yutao Qi; Proceedings - International Conference on Image Processing</w:t>
+      </w:r>
+      <w:r>
+        <w:rPr>
+          <w:color w:val="1F4E79"/>
+          <w:sz w:val="18"/>
+        </w:rPr>
+        <w:t xml:space="preserve">  |  https://doi.org/10.1109/icip51287.2024.10647506</w:t>
+      </w:r>
+    </w:p>
+    <w:p>
+      <w:r>
+        <w:rPr>
+          <w:i/>
+          <w:sz w:val="18"/>
+        </w:rPr>
+        <w:t>Verdict evidence: TCT+ (2024). Evidence: "our method (TCT+) achieves efficient aerial tracking, outperforming our baseline (TCTrack) on UAV123, DTB70, and UAV123@10fps. Our code is available at github.com/wolfwaytx/TCTPlus". Builds on TCTrack as the base framework and replaces the similarity-map refinement (AT-Transformer) with a sparse transformer refinement. Code publicly available.</w:t>
+      </w:r>
+    </w:p>
+    <w:p>
+      <w:r>
+        <w:t>Transformers have significantly enhanced tracking performance in visual tracking tasks. The key to its success lies in its powerful self-attention mechanism. Most current research focuses on using Transformers for feature extraction to concentrate on the target itself, with limited attention given to the refinement of similarity map. The refinement of the similarity map aims to adjust the focus on the target information itself. However, naive self-attention lacks the ability to prioritize the most important information and is easily influenced by other information. In this paper, we introduce a sparse attention mechanism to handle the refinement of the similarity map module, tackling this issue and achieving more accurate tracking. Additionally, we have constructed a more suitable encoder to effectively encode spatial features and temporal information. Extensive experiments demonstrate that our method (TCT+) achieves efficient aerial tracking, outperforming our baseline (TCTrack) on UAV123, DTB70, and UAV123@10fps. Our code is available at https://github.com/wolfwaytx/TCTPlus.</w:t>
+      </w:r>
+    </w:p>
+    <w:p>
+      <w:pPr>
+        <w:pStyle w:val="Heading2"/>
+      </w:pPr>
+      <w:r>
+        <w:t>3. Temporal Context Attention-Based Tracker for UAV Tracking (2023)</w:t>
+      </w:r>
+    </w:p>
+    <w:p>
+      <w:r>
+        <w:rPr>
+          <w:i/>
+          <w:sz w:val="18"/>
+        </w:rPr>
+        <w:t>Yuxiao Yin, Yungang Liu, Yongchao Man, Fengzhong Li, Yuan Wang; Chinese Control Conference (CCC)</w:t>
+      </w:r>
+      <w:r>
+        <w:rPr>
+          <w:color w:val="1F4E79"/>
+          <w:sz w:val="18"/>
+        </w:rPr>
+        <w:t xml:space="preserve">  |  https://doi.org/10.23919/ccc58697.2023.10240950</w:t>
+      </w:r>
+    </w:p>
+    <w:p>
+      <w:r>
+        <w:rPr>
+          <w:i/>
+          <w:sz w:val="18"/>
+        </w:rPr>
+        <w:t>Verdict evidence: Evidence: "Inspired by the framework of TCTrack, a temporal context attention-based tracker is proposed for Unmanned Aerial Vehicle (UAV)". Framework-level derivation of TCTrack with an attention-based temporal context mechanism.</w:t>
+      </w:r>
+    </w:p>
+    <w:p>
+      <w:r>
+        <w:t>Inspired by the framework of TCTrack, a temporal context attention-based tracker is proposed for Unmanned Aerial Vehicle(UAV). The instruction of attention mechanism enables trackers to pay attention to more effective feature knowledge in order to compensate the problem that shallow network feature extraction of UAV tracker is limited, therefore the attention module of multi-feature information fusion based on temporal context is proposed to produce more distinguishable feature representation. In addition, considering the relationship between context similarities, we propose the lightweight temporal transformer(LT-Trans) to increase the execution speed of the model. Finally, the evaluation experiments of four air tracking benchmarks show our tracker compared with currently popular trackers makes more excellent performance.</w:t>
+      </w:r>
+    </w:p>
+    <w:p>
+      <w:pPr>
+        <w:pStyle w:val="Heading2"/>
+      </w:pPr>
+      <w:r>
+        <w:t>4. The UAV Single Target Tracking Algorithm Based on Multimodal Data (2025)</w:t>
+      </w:r>
+    </w:p>
+    <w:p>
+      <w:r>
+        <w:rPr>
+          <w:i/>
+          <w:sz w:val="18"/>
+        </w:rPr>
+        <w:t>Changzhou Yu, Yu Xie, Siyuan Liu, Zihan Gao, Rongqing Huang, Bo-Lun Chen; International Conference on Advanced Algorithms and Control Engineering (ICAACE)</w:t>
+      </w:r>
+      <w:r>
+        <w:rPr>
+          <w:color w:val="1F4E79"/>
+          <w:sz w:val="18"/>
+        </w:rPr>
+        <w:t xml:space="preserve">  |  https://doi.org/10.1109/icaace65325.2025.11019249</w:t>
+      </w:r>
+    </w:p>
+    <w:p>
+      <w:r>
+        <w:rPr>
+          <w:i/>
+          <w:sz w:val="18"/>
+        </w:rPr>
+        <w:t>Verdict evidence: Evidence: "Based on the TCTrack algorithm, this paper conducted multimodal data fusion feature extraction, combined with visible light, thermal infrared information...". Extends TCTrack to multimodal (RGB+TIR) inputs.</w:t>
+      </w:r>
+    </w:p>
+    <w:p>
+      <w:r>
+        <w:t>With the rapid development of drone technology, drone target tracking has become one of the key technologies in drone applications. However, single modal data often has limitations in complex scenes, such as changes in lighting, occlusion, and background interference. Therefore, multimodal data fusion has shown great potential in the field of target tracking. Based on the TCTrack algorithm, this paper conducted multimodal data fusion feature extraction, combined with visible light, thermal infrared information, and TCTrack's utilization of contextual information between consecutive frames, significantly improving the robustness and accuracy of target tracking. The experimental results show that the algorithm exhibits excellent tracking performance in various complex scenarios, significantly improves target localization accuracy, and demonstrates strong adaptability in dynamic environments.</w:t>
+      </w:r>
+    </w:p>
+    <w:p>
+      <w:pPr>
+        <w:pStyle w:val="Heading1"/>
+      </w:pPr>
+      <w:r>
+        <w:t>Tier 2 - System integrations (uses TCTrack, no algorithmic development) (1)</w:t>
+      </w:r>
+    </w:p>
+    <w:p>
+      <w:pPr>
+        <w:pStyle w:val="Heading2"/>
+      </w:pPr>
+      <w:r>
+        <w:t>1. Multi-Type Target Detection and Tracking in UAV Images under Typical Scenarios (2024)</w:t>
+      </w:r>
+    </w:p>
+    <w:p>
+      <w:r>
+        <w:rPr>
+          <w:i/>
+          <w:sz w:val="18"/>
+        </w:rPr>
+        <w:t>Lei Hou, Hejun Lv, Beixi Jia, Yang Li, Linghao Kong, Hongguang Li; IEEE International Conference on Unmanned Systems (ICUS)</w:t>
+      </w:r>
+      <w:r>
+        <w:rPr>
+          <w:color w:val="1F4E79"/>
+          <w:sz w:val="18"/>
+        </w:rPr>
+        <w:t xml:space="preserve">  |  https://doi.org/10.1109/icus61736.2024.10839947</w:t>
+      </w:r>
+    </w:p>
+    <w:p>
+      <w:r>
+        <w:rPr>
+          <w:i/>
+          <w:sz w:val="18"/>
+        </w:rPr>
+        <w:t>Verdict evidence: Evidence: "we developed a stable and reliable UAV image target detection and tracking system based on the YOLOv5 and TCTrack networks". Integrates TCTrack as a pipeline component; does not develop the tracker itself.</w:t>
+      </w:r>
+    </w:p>
+    <w:p>
+      <w:r>
+        <w:t>Despite significant advances in UAV target detection and tracking algorithms, real-world flight tests and data validation remain insufficient. In this study, we developed a stable and reliable UAV image target detection and tracking system based on the YOLOv5 and TCTrack networks. The system demonstrated excellent stability and reliability in laboratory-simulated scenarios, particularly excelling in target recognition accuracy. Additionally, the system was tested in real UAV flight scenarios, showcasing robust real-time performance suitable for various task scenarios. Furthermore, we collected and annotated a comprehensive outdoor multi-scene target detection dataset by operating different types of UAVs to further validate and optimize the algorithm.</w:t>
+      </w:r>
+    </w:p>
+    <w:p>
+      <w:pPr>
+        <w:pStyle w:val="Heading1"/>
+      </w:pPr>
+      <w:r>
+        <w:t>Tier 3 - Adjacent same-line work (not demonstrable build-on) (3)</w:t>
+      </w:r>
+    </w:p>
+    <w:p>
+      <w:pPr>
+        <w:pStyle w:val="Heading2"/>
+      </w:pPr>
+      <w:r>
+        <w:t>1. Multi-Step Temporal Modeling for UAV Tracking (2024)</w:t>
       </w:r>
     </w:p>
     <w:p>
@@ -100,7 +268,7 @@
           <w:i/>
           <w:sz w:val="18"/>
         </w:rPr>
-        <w:t>Why a development: MT-Track evaluated 'extensively' with TCTrack as reference design for temporal extraction - multi-step temporal modeling generalizing TCTrack's single-step memory.</w:t>
+        <w:t>Verdict evidence: MT-Track (2024). Partial evidence: discusses temporal-context design "as TCTrack [25]" at feature-extraction level, generalizes to multi-step temporal modeling. Same research line; not demonstrably built on TCTrack code/framework.</w:t>
       </w:r>
     </w:p>
     <w:p>
@@ -113,7 +281,7 @@
         <w:pStyle w:val="Heading2"/>
       </w:pPr>
       <w:r>
-        <w:t>3. Spatial-Temporal Contextual Aggregation Siamese Network for UAV Tracking (2024)</w:t>
+        <w:t>2. Spatial-Temporal Contextual Aggregation Siamese Network for UAV Tracking (2024)</w:t>
       </w:r>
     </w:p>
     <w:p>
@@ -138,7 +306,7 @@
           <w:i/>
           <w:sz w:val="18"/>
         </w:rPr>
-        <w:t>Why a development: Same authors' full version of the lightweight temporal-context tracker - extends TCTrack's temporal transformer into spatial+temporal contextual aggregation.</w:t>
+        <w:t>Verdict evidence: Discusses TCTrack's transformer design, then proposes spatial-temporal contextual aggregation as an alternative mechanism. Same line, not a demonstrated build-on.</w:t>
       </w:r>
     </w:p>
     <w:p>
@@ -151,7 +319,7 @@
         <w:pStyle w:val="Heading2"/>
       </w:pPr>
       <w:r>
-        <w:t>4. Temporal contexts for motion tracking in ultrasound sequences with information bottleneck (2023)</w:t>
+        <w:t>3. Lightweight Spatial-Temporal Contextual Aggregation Siamese Network for Unmanned Aerial Vehicle Tracking (2024)</w:t>
       </w:r>
     </w:p>
     <w:p>
@@ -160,14 +328,14 @@
           <w:i/>
           <w:sz w:val="18"/>
         </w:rPr>
-        <w:t>Mengxue Sun, Wenhui Huang, Huili Zhang, Yunfeng Shi, Jiale Wang, Qingtao Gong, Xiaoyan Wang; Medical Physics</w:t>
+        <w:t>Qiqi Chen, Jinghong Liu, Faxue Liu, Fang Xu, Chenglong Liu; Drones</w:t>
       </w:r>
       <w:r>
         <w:rPr>
           <w:color w:val="1F4E79"/>
           <w:sz w:val="18"/>
         </w:rPr>
-        <w:t xml:space="preserve">  |  https://doi.org/10.1002/mp.16339</w:t>
+        <w:t xml:space="preserve">  |  https://doi.org/10.3390/drones8010024</w:t>
       </w:r>
     </w:p>
     <w:p>
@@ -176,88 +344,12 @@
           <w:i/>
           <w:sz w:val="18"/>
         </w:rPr>
-        <w:t>Why a development: modifies TCTrack's TAdaCNN component (matched: 'tadacnn')</w:t>
+        <w:t>Verdict evidence: References TCTrack's work and designs a lightweight adaptive temporal-context module as an alternative. Same line, not a demonstrated build-on.</w:t>
       </w:r>
     </w:p>
     <w:p>
       <w:r>
-        <w:t>BACKGROUND: Recently, deep convolutional neural networks (CNNs) have been widely adopted for ultrasound sequence tracking and shown to perform satisfactorily. However, existing trackers ignore the rich temporal contexts that exists between consecutive frames, making it difficult for these trackers to perceive information about the motion of the target. PURPOSE: In this paper, we propose a sophisticated method to fully utilize temporal contexts for ultrasound sequences tracking with information bottleneck. This method determines the temporal contexts between consecutive frames to perform both feature extraction and similarity graph refinement, and information bottleneck is integrated into the feature refinement process. METHODS: The proposed tracker combined three models. First, online temporal adaptive convolutional neural network (TAdaCNN) is proposed to focus on feature extraction and enhance spatial features using temporal information. Second, information bottleneck (IB) is incorporated to achieve more accurate target tracking by maximally limiting the amount of information in the network and discarding irrelevant information. Finally, we propose temporal adaptive transformer (TA-Trans) that efficiently encodes temporal knowledge by decoding it for similarity graph refinement. The tracker was trained on 2015 MICCAI Challenge on Liver Ultrasound Tracking (CLUST) dataset to evaluate the performance of the proposed method by calculating the tracking error (TE) between the predicted landmarks and the ground truth landmarks for each frame. The experimental results are compared with 13 state-of-the-art methods, and ablation studies are conducted. RESULTS: On CLUST 2015 dataset, our proposed model achieves a mean TE of 0.81 ± 0.74 mm and a maximum TE of 1.93 mm for 85 point-landmarks across 39 ultrasound sequences in the 2D sequences. Tracking speed ranged from 41 to 63 frames per second (fps). CONCLUSIONS: This study demonstrates a new integrated workflow for ultrasound sequences motion tracking. The results show that the model has excellent accuracy and robustness. Reliable and accurate motion estimation is provided for applications requiring real-time motion estimation in the context of ultrasound-guided radiation therapy.</w:t>
-      </w:r>
-    </w:p>
-    <w:p>
-      <w:pPr>
-        <w:pStyle w:val="Heading2"/>
-      </w:pPr>
-      <w:r>
-        <w:t>5. DiffTF++: 3D-Aware Diffusion Transformer for Large-Vocabulary 3D Generation (2025)</w:t>
-      </w:r>
-    </w:p>
-    <w:p>
-      <w:r>
-        <w:rPr>
-          <w:i/>
-          <w:sz w:val="18"/>
-        </w:rPr>
-        <w:t>Ziang Cao, Fangzhou Hong, Tong Wu, Liang Pan, Ziwei Liu; IEEE Transactions on Pattern Analysis and Machine Intelligence</w:t>
-      </w:r>
-      <w:r>
-        <w:rPr>
-          <w:color w:val="1F4E79"/>
-          <w:sz w:val="18"/>
-        </w:rPr>
-        <w:t xml:space="preserve">  |  https://doi.org/10.1109/tpami.2025.3528247</w:t>
-      </w:r>
-    </w:p>
-    <w:p>
-      <w:r>
-        <w:rPr>
-          <w:i/>
-          <w:sz w:val="18"/>
-        </w:rPr>
-        <w:t>Why a development: authors' own stronger version (matched: 'stronger version')</w:t>
-      </w:r>
-    </w:p>
-    <w:p>
-      <w:r>
-        <w:t>Generating diverse and high-quality 3D assets automatically poses a fundamental yet challenging task in 3D computer vision. Despite extensive efforts in 3D generation, existing optimization-based approaches struggle to produce large-scale 3D assets efficiently. Meanwhile, feed-forward methods often focus on generating only a single category or a few categories, limiting their generalizability. Therefore, we introduce a diffusion-based feed-forward framework to address these challenges with a single model. To handle the large diversity and complexity in geometry and texture across categories efficiently, we 1) adopt improved triplane to guarantee efficiency; 2) introduce the 3D-aware transformer to aggregate the generalized 3D knowledge with specialized 3D features; and 3) devise the 3D-aware encoder/decoder to enhance the generalized 3D knowledge. Building upon our 3D-aware Diffusion model with TransFormer, DiffTF, we propose a stronger version for 3D generation, i.e., DiffTF++. It boils down to two parts: multi-view reconstruction loss and triplane refinement. Specifically, we utilize multi-view reconstruction loss to fine-tune the diffusion model and triplane decoder, thereby avoiding the negative influence caused by reconstruction errors and improving texture synthesis. By eliminating the mismatch between the two stages, the generative performance is enhanced, especially in texture. Additionally, a 3D-aware refinement process is introduced to filter out artifacts and refine triplanes, resulting in the generation of more intricate and reasonable details. Extensive experiments on ShapeNet and OmniObject3D convincingly demonstrate the effectiveness of our proposed modules and the state-of-the-art 3D object generation performance with large diversity, rich semantics, and high quality.</w:t>
-      </w:r>
-    </w:p>
-    <w:p>
-      <w:pPr>
-        <w:pStyle w:val="Heading2"/>
-      </w:pPr>
-      <w:r>
-        <w:t>6. Efficient Template Distinction Modeling Tracker With Temporal Contexts for Aerial Tracking (2024)</w:t>
-      </w:r>
-    </w:p>
-    <w:p>
-      <w:r>
-        <w:rPr>
-          <w:i/>
-          <w:sz w:val="18"/>
-        </w:rPr>
-        <w:t>Hong Zhang, Wanli Xing, Huakao Lin, Hanyang Liu, Y. F. Yang; IEEE Transactions on Geoscience and Remote Sensing</w:t>
-      </w:r>
-      <w:r>
-        <w:rPr>
-          <w:color w:val="1F4E79"/>
-          <w:sz w:val="18"/>
-        </w:rPr>
-        <w:t xml:space="preserve">  |  https://doi.org/10.1109/tgrs.2024.3440994</w:t>
-      </w:r>
-    </w:p>
-    <w:p>
-      <w:r>
-        <w:rPr>
-          <w:i/>
-          <w:sz w:val="18"/>
-        </w:rPr>
-        <w:t>Why a development: works directly within the TCTrack framework line (matched: 'temporal contexts for aerial tracking')</w:t>
-      </w:r>
-    </w:p>
-    <w:p>
-      <w:r>
-        <w:t>In recent years, trackers based on neural networks have demonstrated excellent tracking performance. Compared to general tracking tasks, aerial tracking tasks require more stringent operational efficiency of the tracker. Furthermore, since aerial devices such as unmanned aerial vehicles usually shoot from a high altitude, the tracked target occupies fewer pixels, resulting in scarce target discrimination information and more susceptibility to interference from cluttered backgrounds. Unfortunately, existing trackers usually model the entire template region nondifferently, which tends to confuse target and background information in the template and reduce the robustness of the tracker in complex scenes. Additionally, most tracking networks refuse or only refer to a single feature layer to learn the risky temporal context information, which makes it difficult to accurately supplement the scarce target discrimination information. To this end, we propose an efficient template distinction modeling tracker with temporal contexts, called ETDMT, designed to improve the complex scene robustness of aerial tracking through a combination of template distinction modeling and temporal context analysis. The tracker employs a template distinction modeling transformer network, which distinguishes between target and background elements and adopts different modeling approaches for different elements to alleviate the background interference problem prevalent in aerial tracking. Then, the temporal contexts of the tracker are complemented by a global-local spatial awareness update module, which enhances the tracker’s understanding of the latest target state by comprehensively evaluating and adjusting dynamic templates. Extensive experiments demonstrate that the proposed ETDMT achieves advanced aerial tracking performance and efficient running speed.</w:t>
+        <w:t>Benefiting from the powerful feature extraction capability of deep learning, the Siamese tracker stands out due to its advanced tracking performance. However, constrained by the complex backgrounds of aerial tracking, such as low resolution, occlusion, similar objects, small objects, scale variation, aspect ratio change, deformation and limited computational resources, efficient and accurate aerial tracking is still difficult to realize. In this work, we design a lightweight and efficient adaptive temporal contextual aggregation Siamese network for aerial tracking, which is designed with a parallel atrous module (PAM) and adaptive temporal context aggregation model (ATCAM) to mitigate the above problems. Firstly, by using a series of atrous convolutions with different dilation rates in parallel, the PAM can simultaneously extract and aggregate multi-scale features with spatial contextual information at the same feature map, which effectively improves the ability to cope with changes in target appearance caused by challenges such as aspect ratio change, occlusion, scale variation, etc. Secondly, the ATCAM adaptively introduces temporal contextual information to the target frame through the encoder-decoder structure, which helps the tracker resist interference and recognize the target when it is difficult to extract high-resolution features such as low-resolution, similar objects. Finally, experiments on the UAV20L, UAV123@10fps and DTB70 benchmarks demonstrate the impressive performance of the proposed network running at a high speed of over 75.5 fps on the NVIDIA 3060Ti.</w:t>
       </w:r>
     </w:p>
     <w:p>
@@ -265,12 +357,7 @@
         <w:pStyle w:val="Heading1"/>
       </w:pPr>
       <w:r>
-        <w:t>Unverifiable Without Full Text</w:t>
-      </w:r>
-    </w:p>
-    <w:p>
-      <w:r>
-        <w:t>No abstract available anywhere; title suggests possible TCTrack-line work. Require full-text reading to confirm or exclude:</w:t>
+        <w:t>Unverifiable (no abstract available)</w:t>
       </w:r>
     </w:p>
     <w:p>
@@ -278,7 +365,7 @@
         <w:pStyle w:val="ListBullet"/>
       </w:pPr>
       <w:r>
-        <w:t>Dynamic region-aware transformer backbone network for visual tracking (2024) — Engineering Applications of Artificial Intelligence — https://doi.org/10.1016/j.engappai.2024.108329</w:t>
+        <w:t>Dynamic region-aware transformer backbone network for visual tracking (2024) - Engineering Applications of Artificial Intelligence - https://doi.org/10.1016/j.engappai.2024.108329</w:t>
       </w:r>
     </w:p>
     <w:p>
@@ -286,7 +373,7 @@
         <w:pStyle w:val="ListBullet"/>
       </w:pPr>
       <w:r>
-        <w:t>Incorporating prior knowledge and temporal memory transformer network for satellite video object tracking (2025) — ISPRS Journal of Photogrammetry and Remote Sensing — https://doi.org/10.1016/j.isprsjprs.2025.07.032</w:t>
+        <w:t>Incorporating prior knowledge and temporal memory transformer network for satellite video object tracking (2025) - ISPRS Journal of Photogrammetry and Remote Sensing - https://doi.org/10.1016/j.isprsjprs.2025.07.032</w:t>
       </w:r>
     </w:p>
     <w:p>
@@ -294,7 +381,7 @@
         <w:pStyle w:val="ListBullet"/>
       </w:pPr>
       <w:r>
-        <w:t>Target-aware pooling combining global contexts for aerial tracking (2024) — The Visual Computer — https://doi.org/10.1007/s00371-024-03282-w</w:t>
+        <w:t>Target-aware pooling combining global contexts for aerial tracking (2024) - The Visual Computer - https://doi.org/10.1007/s00371-024-03282-w</w:t>
       </w:r>
     </w:p>
     <w:p>
@@ -302,7 +389,7 @@
         <w:pStyle w:val="ListBullet"/>
       </w:pPr>
       <w:r>
-        <w:t>A novel lightweight Siamese-like tracker based on transformers with unidirectional mixed attention (2026) — Pattern Analysis and Applications — https://doi.org/10.1007/s10044-026-01771-3</w:t>
+        <w:t>A novel lightweight Siamese-like tracker based on transformers with unidirectional mixed attention (2026) - Pattern Analysis and Applications - https://doi.org/10.1007/s10044-026-01771-3</w:t>
       </w:r>
     </w:p>
     <w:p>
@@ -310,7 +397,7 @@
         <w:pStyle w:val="ListBullet"/>
       </w:pPr>
       <w:r>
-        <w:t>Re-detection UAV target tracking algorithm based on twin network (2026) — https://doi.org/10.1109/ciml69155.2026.11692792</w:t>
+        <w:t>Re-detection UAV target tracking algorithm based on twin network (2026) - https://doi.org/10.1109/ciml69155.2026.11692792</w:t>
       </w:r>
     </w:p>
     <w:p>
@@ -318,7 +405,7 @@
         <w:pStyle w:val="ListBullet"/>
       </w:pPr>
       <w:r>
-        <w:t>Robust Transformer Tracking with Minimum Entropy Criterion Model Update (2023) — SSRN Electronic Journal — https://doi.org/10.2139/ssrn.4504064</w:t>
+        <w:t>Robust Transformer Tracking with Minimum Entropy Criterion Model Update (2023) - SSRN Electronic Journal - https://doi.org/10.2139/ssrn.4504064</w:t>
       </w:r>
     </w:p>
     <w:p>
@@ -326,7 +413,7 @@
         <w:pStyle w:val="ListBullet"/>
       </w:pPr>
       <w:r>
-        <w:t>Target-Aware Gaussian Distribution Estimation for Satellite Video Object Tracking (2026) — IEEE Transactions on Geoscience and Remote Sensing — https://doi.org/10.1109/tgrs.2026.3704141</w:t>
+        <w:t>Target-Aware Gaussian Distribution Estimation for Satellite Video Object Tracking (2026) - IEEE Transactions on Geoscience and Remote Sensing - https://doi.org/10.1109/tgrs.2026.3704141</w:t>
       </w:r>
     </w:p>
     <w:sectPr>

</xml_diff>

<commit_message>
true_development_citations.docx: re-classified on full merged corpus with evidence quotes
</commit_message>
<xml_diff>
--- a/true_development_citations.docx
+++ b/true_development_citations.docx
@@ -7,7 +7,7 @@
         <w:pStyle w:val="Title"/>
       </w:pPr>
       <w:r>
-        <w:t>True Developments of TCTrack (Re-Reviewed, Evidence-Quoted)</w:t>
+        <w:t>True Developments of TCTrack (Re-Reviewed on Full Merged Corpus, Evidence-Quoted)</w:t>
       </w:r>
     </w:p>
     <w:p>
@@ -16,12 +16,12 @@
           <w:i/>
           <w:sz w:val="18"/>
         </w:rPr>
-        <w:t>Reference baseline: TCTrack: Temporal Contexts for Aerial Tracking (Cao et al., CVPR 2022, arXiv:2203.01885). Compiled 2026-10-11. Method: all 269 citing works re-classified paper-by-paper with substring-exact title matching and abstract evidence quotes. DIRECT = abstract explicitly states build-on/baseline/framework derivation of TCTrack. SYSTEM_INTEGRATION = uses TCTrack as a pipeline component without developing it. ADJACENT = same temporal-context aerial-tracking line, discusses TCTrack's design, no demonstrable build-on. MENTION = citation/comparison only. This version corrects an earlier pass that had phrase-collision false positives and exact-title-match misses.</w:t>
+        <w:t>Reference baseline: TCTrack: Temporal Contexts for Aerial Tracking (Cao et al., CVPR 2022, arXiv:2203.01885). Compiled 2026-10-11. Method: all 355 unique citing works (OpenAlex + Semantic Scholar merged, deduplicated) classified paper-by-paper; DIRECT only when the abstract explicitly states build-on/baseline/framework derivation of TCTrack. Every verdict carries its abstract evidence quote.</w:t>
       </w:r>
     </w:p>
     <w:p>
       <w:r>
-        <w:t>DIRECT: 4 | SYSTEM_INTEGRATION: 1 | ADJACENT: 3 | MENTION: 254 | UNVERIFIABLE (no abstract): 7</w:t>
+        <w:t>DIRECT: 4 | SYSTEM_INTEGRATION: 1 | ADJACENT: 3 | MENTION: 345 | UNVERIFIABLE: 2</w:t>
       </w:r>
     </w:p>
     <w:p>
@@ -62,7 +62,7 @@
           <w:i/>
           <w:sz w:val="18"/>
         </w:rPr>
-        <w:t>Verdict evidence: TCTrack++ (same authors). Evidence: "we propose a two-level framework (TCTrack)... Based on it, we propose a stronger version for real-world visual tracking, i.e., TCTrack++". Adds online background-exclusion modeling, TAdaCNNv2, refined AT-Transformer.</w:t>
+        <w:t>Verdict evidence: TCTrack++ (same authors). Evidence: "we propose a two-level framework (TCTrack)... Based on it, we propose a stronger version for real-world visual tracking, i.e., TCTrack++".</w:t>
       </w:r>
     </w:p>
     <w:p>
@@ -100,7 +100,7 @@
           <w:i/>
           <w:sz w:val="18"/>
         </w:rPr>
-        <w:t>Verdict evidence: TCT+ (2024). Evidence: "our method (TCT+) achieves efficient aerial tracking, outperforming our baseline (TCTrack) on UAV123, DTB70, and UAV123@10fps. Our code is available at github.com/wolfwaytx/TCTPlus". Builds on TCTrack as the base framework and replaces the similarity-map refinement (AT-Transformer) with a sparse transformer refinement. Code publicly available.</w:t>
+        <w:t>Verdict evidence: TCT+ (2024). Evidence: "our method (TCT+) achieves efficient aerial tracking, outperforming our baseline (TCTrack) on UAV123, DTB70, and UAV123@10fps... code available at github.com/wolfwaytx/TCTPlus".</w:t>
       </w:r>
     </w:p>
     <w:p>
@@ -138,7 +138,7 @@
           <w:i/>
           <w:sz w:val="18"/>
         </w:rPr>
-        <w:t>Verdict evidence: Evidence: "Inspired by the framework of TCTrack, a temporal context attention-based tracker is proposed for Unmanned Aerial Vehicle (UAV)". Framework-level derivation of TCTrack with an attention-based temporal context mechanism.</w:t>
+        <w:t>Verdict evidence: Evidence: "Inspired by the framework of TCTrack, a temporal context attention-based tracker is proposed for Unmanned Aerial Vehicle (UAV)".</w:t>
       </w:r>
     </w:p>
     <w:p>
@@ -176,7 +176,7 @@
           <w:i/>
           <w:sz w:val="18"/>
         </w:rPr>
-        <w:t>Verdict evidence: Evidence: "Based on the TCTrack algorithm, this paper conducted multimodal data fusion feature extraction, combined with visible light, thermal infrared information...". Extends TCTrack to multimodal (RGB+TIR) inputs.</w:t>
+        <w:t>Verdict evidence: Evidence: "Based on the TCTrack algorithm, this paper conducted multimodal data fusion feature extraction, combined with visible light, thermal infrared information...".</w:t>
       </w:r>
     </w:p>
     <w:p>
@@ -222,7 +222,7 @@
           <w:i/>
           <w:sz w:val="18"/>
         </w:rPr>
-        <w:t>Verdict evidence: Evidence: "we developed a stable and reliable UAV image target detection and tracking system based on the YOLOv5 and TCTrack networks". Integrates TCTrack as a pipeline component; does not develop the tracker itself.</w:t>
+        <w:t>Verdict evidence: Evidence: "we developed a stable and reliable UAV image target detection and tracking system based on the YOLOv5 and TCTrack networks". Uses TCTrack as pipeline component; no algorithmic development.</w:t>
       </w:r>
     </w:p>
     <w:p>
@@ -235,7 +235,7 @@
         <w:pStyle w:val="Heading1"/>
       </w:pPr>
       <w:r>
-        <w:t>Tier 3 - Adjacent same-line work (not demonstrable build-on) (3)</w:t>
+        <w:t>Tier 3 - Adjacent same-line work (no demonstrable build-on) (3)</w:t>
       </w:r>
     </w:p>
     <w:p>
@@ -268,7 +268,7 @@
           <w:i/>
           <w:sz w:val="18"/>
         </w:rPr>
-        <w:t>Verdict evidence: MT-Track (2024). Partial evidence: discusses temporal-context design "as TCTrack [25]" at feature-extraction level, generalizes to multi-step temporal modeling. Same research line; not demonstrably built on TCTrack code/framework.</w:t>
+        <w:t>Verdict evidence: MT-Track (2024). Discusses temporal-context design "as TCTrack [25]", generalizes to multi-step temporal modeling. Same line; no demonstrable build-on.</w:t>
       </w:r>
     </w:p>
     <w:p>
@@ -306,7 +306,7 @@
           <w:i/>
           <w:sz w:val="18"/>
         </w:rPr>
-        <w:t>Verdict evidence: Discusses TCTrack's transformer design, then proposes spatial-temporal contextual aggregation as an alternative mechanism. Same line, not a demonstrated build-on.</w:t>
+        <w:t>Verdict evidence: Discusses TCTrack's transformer design, then proposes spatial-temporal contextual aggregation as alternative mechanism.</w:t>
       </w:r>
     </w:p>
     <w:p>
@@ -344,7 +344,7 @@
           <w:i/>
           <w:sz w:val="18"/>
         </w:rPr>
-        <w:t>Verdict evidence: References TCTrack's work and designs a lightweight adaptive temporal-context module as an alternative. Same line, not a demonstrated build-on.</w:t>
+        <w:t>Verdict evidence: References TCTrack's work; designs a lightweight adaptive temporal-context module as alternative.</w:t>
       </w:r>
     </w:p>
     <w:p>
@@ -357,47 +357,7 @@
         <w:pStyle w:val="Heading1"/>
       </w:pPr>
       <w:r>
-        <w:t>Unverifiable (no abstract available)</w:t>
-      </w:r>
-    </w:p>
-    <w:p>
-      <w:pPr>
-        <w:pStyle w:val="ListBullet"/>
-      </w:pPr>
-      <w:r>
-        <w:t>Dynamic region-aware transformer backbone network for visual tracking (2024) - Engineering Applications of Artificial Intelligence - https://doi.org/10.1016/j.engappai.2024.108329</w:t>
-      </w:r>
-    </w:p>
-    <w:p>
-      <w:pPr>
-        <w:pStyle w:val="ListBullet"/>
-      </w:pPr>
-      <w:r>
-        <w:t>Incorporating prior knowledge and temporal memory transformer network for satellite video object tracking (2025) - ISPRS Journal of Photogrammetry and Remote Sensing - https://doi.org/10.1016/j.isprsjprs.2025.07.032</w:t>
-      </w:r>
-    </w:p>
-    <w:p>
-      <w:pPr>
-        <w:pStyle w:val="ListBullet"/>
-      </w:pPr>
-      <w:r>
-        <w:t>Target-aware pooling combining global contexts for aerial tracking (2024) - The Visual Computer - https://doi.org/10.1007/s00371-024-03282-w</w:t>
-      </w:r>
-    </w:p>
-    <w:p>
-      <w:pPr>
-        <w:pStyle w:val="ListBullet"/>
-      </w:pPr>
-      <w:r>
-        <w:t>A novel lightweight Siamese-like tracker based on transformers with unidirectional mixed attention (2026) - Pattern Analysis and Applications - https://doi.org/10.1007/s10044-026-01771-3</w:t>
-      </w:r>
-    </w:p>
-    <w:p>
-      <w:pPr>
-        <w:pStyle w:val="ListBullet"/>
-      </w:pPr>
-      <w:r>
-        <w:t>Re-detection UAV target tracking algorithm based on twin network (2026) - https://doi.org/10.1109/ciml69155.2026.11692792</w:t>
+        <w:t>Unverifiable (no abstract available anywhere)</w:t>
       </w:r>
     </w:p>
     <w:p>
@@ -413,7 +373,7 @@
         <w:pStyle w:val="ListBullet"/>
       </w:pPr>
       <w:r>
-        <w:t>Target-Aware Gaussian Distribution Estimation for Satellite Video Object Tracking (2026) - IEEE Transactions on Geoscience and Remote Sensing - https://doi.org/10.1109/tgrs.2026.3704141</w:t>
+        <w:t>DePrompt-track: Real-time ultrasound landmark tracking via deformable attention and historical mask prompt (2026) - Neurocomputing - https://doi.org/10.1016/j.neucom.2026.132845</w:t>
       </w:r>
     </w:p>
     <w:sectPr>

</xml_diff>

<commit_message>
Severe audit: corrected ultrasound TAdaCNN (DIRECT) and BSTrack (ADJACENT); all 355 abstracts component-scanned
</commit_message>
<xml_diff>
--- a/true_development_citations.docx
+++ b/true_development_citations.docx
@@ -7,7 +7,7 @@
         <w:pStyle w:val="Title"/>
       </w:pPr>
       <w:r>
-        <w:t>True Developments of TCTrack (Re-Reviewed on Full Merged Corpus, Evidence-Quoted)</w:t>
+        <w:t>True Developments of TCTrack (Severely Audited, Evidence-Quoted)</w:t>
       </w:r>
     </w:p>
     <w:p>
@@ -16,12 +16,12 @@
           <w:i/>
           <w:sz w:val="18"/>
         </w:rPr>
-        <w:t>Reference baseline: TCTrack: Temporal Contexts for Aerial Tracking (Cao et al., CVPR 2022, arXiv:2203.01885). Compiled 2026-10-11. Method: all 355 unique citing works (OpenAlex + Semantic Scholar merged, deduplicated) classified paper-by-paper; DIRECT only when the abstract explicitly states build-on/baseline/framework derivation of TCTrack. Every verdict carries its abstract evidence quote.</w:t>
+        <w:t>Reference baseline: TCTrack: Temporal Contexts for Aerial Tracking (Cao et al., CVPR 2022, arXiv:2203.01885). Compiled 2026-10-11. Method: severe audit of all 355 unique citing works (OpenAlex + Semantic Scholar merged, deduplicated). Every abstract was scanned for explicit TCTrack references (word-boundary matched to exclude substring false positives like ATCTrack) AND for TCTrack-component language (TAdaCNN, temporally adaptive convolution, adaptive temporal transformer, similarity map refinement, framework-of/based-on/baseline statements). Every hit was read with its full evidence context and classified manually. DIRECT = abstract explicitly states build-on/baseline/framework derivation or direct adoption of a named TCTrack component. ADJACENT = implements a TCTrack-stage concept without an explicit build-on statement. MENTION = citation/comparison only. This version corrects two earlier errors: the ultrasound TAdaCNN paper (wrongly dismissed as phrase collision) and BSTrack (similarity-map-refinement stage implementer, upgraded to ADJACENT).</w:t>
       </w:r>
     </w:p>
     <w:p>
       <w:r>
-        <w:t>DIRECT: 4 | SYSTEM_INTEGRATION: 1 | ADJACENT: 3 | MENTION: 345 | UNVERIFIABLE: 2</w:t>
+        <w:t>DIRECT: 5 | SYSTEM_INTEGRATION: 1 | ADJACENT: 4 | MENTION: 343 | UNVERIFIABLE (no abstract): 2</w:t>
       </w:r>
     </w:p>
     <w:p>
@@ -29,7 +29,7 @@
         <w:pStyle w:val="Heading1"/>
       </w:pPr>
       <w:r>
-        <w:t>Tier 1 - Direct developments of TCTrack (4)</w:t>
+        <w:t>Tier 1 - Direct developments of TCTrack (5)</w:t>
       </w:r>
     </w:p>
     <w:p>
@@ -75,7 +75,45 @@
         <w:pStyle w:val="Heading2"/>
       </w:pPr>
       <w:r>
-        <w:t>2. Sparse Transformer Refinement Similarity Map for Aerial Tracking (2024)</w:t>
+        <w:t>2. Temporal contexts for motion tracking in ultrasound sequences with information bottleneck (2023)</w:t>
+      </w:r>
+    </w:p>
+    <w:p>
+      <w:r>
+        <w:rPr>
+          <w:i/>
+          <w:sz w:val="18"/>
+        </w:rPr>
+        <w:t>Mengxue Sun, Wenhui Huang, Huili Zhang, Yunfeng Shi, Jiale Wang, Qingtao Gong, Xiaoyan Wang; Medical Physics</w:t>
+      </w:r>
+      <w:r>
+        <w:rPr>
+          <w:color w:val="1F4E79"/>
+          <w:sz w:val="18"/>
+        </w:rPr>
+        <w:t xml:space="preserve">  |  https://doi.org/10.1002/mp.16339</w:t>
+      </w:r>
+    </w:p>
+    <w:p>
+      <w:r>
+        <w:rPr>
+          <w:i/>
+          <w:sz w:val="18"/>
+        </w:rPr>
+        <w:t>Verdict evidence: CORRECTED by severe audit (was MENTION). Evidence: 'First, online temporal adaptive convolutional neural network (TAdaCNN) is proposed to focus on feature extraction and enhance spatial features using temporal information. Second, information bottleneck (IB) is incorporated...' - directly adopts TCTrack's TAdaCNN component, applied cross-domain to ultrasound motion tracking.</w:t>
+      </w:r>
+    </w:p>
+    <w:p>
+      <w:r>
+        <w:t>BACKGROUND: Recently, deep convolutional neural networks (CNNs) have been widely adopted for ultrasound sequence tracking and shown to perform satisfactorily. However, existing trackers ignore the rich temporal contexts that exists between consecutive frames, making it difficult for these trackers to perceive information about the motion of the target. PURPOSE: In this paper, we propose a sophisticated method to fully utilize temporal contexts for ultrasound sequences tracking with information bottleneck. This method determines the temporal contexts between consecutive frames to perform both feature extraction and similarity graph refinement, and information bottleneck is integrated into the feature refinement process. METHODS: The proposed tracker combined three models. First, online temporal adaptive convolutional neural network (TAdaCNN) is proposed to focus on feature extraction and enhance spatial features using temporal information. Second, information bottleneck (IB) is incorporated to achieve more accurate target tracking by maximally limiting the amount of information in the network and discarding irrelevant information. Finally, we propose temporal adaptive transformer (TA-Trans) that efficiently encodes temporal knowledge by decoding it for similarity graph refinement. The tracker was trained on 2015 MICCAI Challenge on Liver Ultrasound Tracking (CLUST) dataset to evaluate the performance of the proposed method by calculating the tracking error (TE) between the predicted landmarks and the ground truth landmarks for each frame. The experimental results are compared with 13 state-of-the-art methods, and ablation studies are conducted. RESULTS: On CLUST 2015 dataset, our proposed model achieves a mean TE of 0.81 ± 0.74 mm and a maximum TE of 1.93 mm for 85 point-landmarks across 39 ultrasound sequences in the 2D sequences. Tracking speed ranged from 41 to 63 frames per second (fps). CONCLUSIONS: This study demonstrates a new integrated workflow for ultrasound sequences motion tracking. The results show that the model has excellent accuracy and robustness. Reliable and accurate motion estimation is provided for applications requiring real-time motion estimation in the context of ultrasound-guided radiation therapy.</w:t>
+      </w:r>
+    </w:p>
+    <w:p>
+      <w:pPr>
+        <w:pStyle w:val="Heading2"/>
+      </w:pPr>
+      <w:r>
+        <w:t>3. Sparse Transformer Refinement Similarity Map for Aerial Tracking (2024)</w:t>
       </w:r>
     </w:p>
     <w:p>
@@ -113,7 +151,7 @@
         <w:pStyle w:val="Heading2"/>
       </w:pPr>
       <w:r>
-        <w:t>3. Temporal Context Attention-Based Tracker for UAV Tracking (2023)</w:t>
+        <w:t>4. Temporal Context Attention-Based Tracker for UAV Tracking (2023)</w:t>
       </w:r>
     </w:p>
     <w:p>
@@ -151,7 +189,7 @@
         <w:pStyle w:val="Heading2"/>
       </w:pPr>
       <w:r>
-        <w:t>4. The UAV Single Target Tracking Algorithm Based on Multimodal Data (2025)</w:t>
+        <w:t>5. The UAV Single Target Tracking Algorithm Based on Multimodal Data (2025)</w:t>
       </w:r>
     </w:p>
     <w:p>
@@ -235,7 +273,7 @@
         <w:pStyle w:val="Heading1"/>
       </w:pPr>
       <w:r>
-        <w:t>Tier 3 - Adjacent same-line work (no demonstrable build-on) (3)</w:t>
+        <w:t>Tier 3 - Adjacent same-line / same-stage work (no demonstrable build-on) (4)</w:t>
       </w:r>
     </w:p>
     <w:p>
@@ -350,6 +388,44 @@
     <w:p>
       <w:r>
         <w:t>Benefiting from the powerful feature extraction capability of deep learning, the Siamese tracker stands out due to its advanced tracking performance. However, constrained by the complex backgrounds of aerial tracking, such as low resolution, occlusion, similar objects, small objects, scale variation, aspect ratio change, deformation and limited computational resources, efficient and accurate aerial tracking is still difficult to realize. In this work, we design a lightweight and efficient adaptive temporal contextual aggregation Siamese network for aerial tracking, which is designed with a parallel atrous module (PAM) and adaptive temporal context aggregation model (ATCAM) to mitigate the above problems. Firstly, by using a series of atrous convolutions with different dilation rates in parallel, the PAM can simultaneously extract and aggregate multi-scale features with spatial contextual information at the same feature map, which effectively improves the ability to cope with changes in target appearance caused by challenges such as aspect ratio change, occlusion, scale variation, etc. Secondly, the ATCAM adaptively introduces temporal contextual information to the target frame through the encoder-decoder structure, which helps the tracker resist interference and recognize the target when it is difficult to extract high-resolution features such as low-resolution, similar objects. Finally, experiments on the UAV20L, UAV123@10fps and DTB70 benchmarks demonstrate the impressive performance of the proposed network running at a high speed of over 75.5 fps on the NVIDIA 3060Ti.</w:t>
+      </w:r>
+    </w:p>
+    <w:p>
+      <w:pPr>
+        <w:pStyle w:val="Heading2"/>
+      </w:pPr>
+      <w:r>
+        <w:t>4. BSTrack: Robust UAV tracking using feature extraction of bilateral filters and sparse attention mechanism (2024)</w:t>
+      </w:r>
+    </w:p>
+    <w:p>
+      <w:r>
+        <w:rPr>
+          <w:i/>
+          <w:sz w:val="18"/>
+        </w:rPr>
+        <w:t>Ke Wang, Zhuhai Wang, Xi-Min Zhang, Mengzhen Liu; Expert systems with applications</w:t>
+      </w:r>
+      <w:r>
+        <w:rPr>
+          <w:color w:val="1F4E79"/>
+          <w:sz w:val="18"/>
+        </w:rPr>
+        <w:t xml:space="preserve">  |  https://doi.org/10.1016/j.eswa.2024.126202</w:t>
+      </w:r>
+    </w:p>
+    <w:p>
+      <w:r>
+        <w:rPr>
+          <w:i/>
+          <w:sz w:val="18"/>
+        </w:rPr>
+        <w:t>Verdict evidence: UPGRADED by severe audit (was MENTION). Evidence: 'we propose a similarity map refinement structure based on sparse attention' - implements TCTrack's own second stage (similarity map refinement) with a sparse-attention mechanism, combined with bilateral-filter-enhanced AlexNet backbone. No explicit build-on statement, hence ADJACENT not DIRECT.</w:t>
+      </w:r>
+    </w:p>
+    <w:p>
+      <w:r>
+        <w:t>In UAV tracking tasks, detailed object information and key features are critical for enhancing tracking performance. The AlexNet feature extraction network relies predominantly on multiple downsampling layers, and as downsampling progresses to deeper layers, feature resolution decreases. Additionally, complex backgrounds amplify noise sensitivity in tracking, impeding the capture of fine object details and spatial information. To address these issues, this paper proposes an AlexNet-based network structure incorporating bilateral filters, aiming to mitigate noise interference during feature extraction and enhance spatial and detail features of the object. The cross-correlation operation, typically employed for feature fusion, lacks feature refinement and selection, limiting the ability to capture essential information in scenarios with scale variations and multiple similar objects. To address this, we propose a similarity map refinement structure based on sparse attention, which focuses on significant regions of the object in the image, integrates global information, and highlights regions most similar to the tracking object, thereby improving tracking accuracy. Finally, we combine the bilateral filter-enhanced AlexNet with the sparse attention-based similarity map refinement structure to develop a UAV tracking method based on bilateral filtering and sparse attention mechanisms, termed BSTrack. Our approach achieves outstanding tracking performance on the UAV123, UAV123_10fps, UAVTrack112_L, DTB70, and UAV20L datasets, with a precision improvement of 2.8% on UAV20L. Additionally, on UAV123, precision is improved by 4.5% and 3.1% in the background clutter and full occlusion scenarios, respectively.</w:t>
       </w:r>
     </w:p>
     <w:p>

</xml_diff>